<commit_message>
Restructure: Replace old guide + worksheets with clean STEM+ ExpoCiencia 2026 versions
</commit_message>
<xml_diff>
--- a/proyecto-contaminacion-mar/fichas-trabajo.docx
+++ b/proyecto-contaminacion-mar/fichas-trabajo.docx
@@ -7,7 +7,7 @@
         <w:pStyle w:val="Title"/>
       </w:pPr>
       <w:r>
-        <w:t xml:space="preserve">Fichas de Trabajo: Contaminación en el Mar</w:t>
+        <w:t xml:space="preserve">Fichas de Trabajo - Proyecto STEM+</w:t>
       </w:r>
     </w:p>
     <w:p>
@@ -26,22 +26,39 @@
         <w:t xml:space="preserve">Mayo 2026</w:t>
       </w:r>
     </w:p>
-    <w:bookmarkStart w:id="28" w:name="X3896f3fbe571ac6a455cb9de4f8215fea903f63"/>
+    <w:bookmarkStart w:id="34" w:name="X2c3dec3e6fced5c6855dfe8dac322666e154664"/>
     <w:p>
       <w:pPr>
         <w:pStyle w:val="Heading1"/>
       </w:pPr>
       <w:r>
-        <w:t xml:space="preserve">🎨 Fichas de Trabajo: Contaminación en el Mar</w:t>
-      </w:r>
-    </w:p>
-    <w:bookmarkStart w:id="21" w:name="ficha-1-detectives-de-basura"/>
+        <w:t xml:space="preserve">🎨 Fichas de Trabajo — Proyecto STEM+: Contaminación en el Mar</w:t>
+      </w:r>
+    </w:p>
+    <w:bookmarkStart w:id="20" w:name="X9263e8f5a2b0c5f6c7a85db7c1ef58f4c4db0a4"/>
     <w:p>
       <w:pPr>
         <w:pStyle w:val="Heading2"/>
       </w:pPr>
       <w:r>
-        <w:t xml:space="preserve">Ficha 1:</w:t>
+        <w:t xml:space="preserve">ExpoCiencia 2026 | Estudiante: Kylian | Grado: 1° (7 años)</w:t>
+      </w:r>
+    </w:p>
+    <w:p>
+      <w:r>
+        <w:pict>
+          <v:rect style="width:0;height:1.5pt" o:hralign="center" o:hrstd="t" o:hr="t"/>
+        </w:pict>
+      </w:r>
+    </w:p>
+    <w:bookmarkEnd w:id="20"/>
+    <w:bookmarkStart w:id="22" w:name="ficha-1-detectives-de-basura"/>
+    <w:p>
+      <w:pPr>
+        <w:pStyle w:val="Heading2"/>
+      </w:pPr>
+      <w:r>
+        <w:t xml:space="preserve">FICHA 1:</w:t>
       </w:r>
       <w:r>
         <w:t xml:space="preserve"> </w:t>
@@ -62,34 +79,47 @@
         <w:t xml:space="preserve">🕵️‍♂️</w:t>
       </w:r>
     </w:p>
-    <w:bookmarkStart w:id="20" w:name="instrucciones"/>
+    <w:bookmarkStart w:id="21" w:name="Xb288a3a41c71c8093731ce6ef0080b310775d9c"/>
     <w:p>
       <w:pPr>
         <w:pStyle w:val="Heading3"/>
       </w:pPr>
       <w:r>
+        <w:t xml:space="preserve">Áreas STEM+: S (Ciencia), M (Matemáticas), T (Tecnología)</w:t>
+      </w:r>
+    </w:p>
+    <w:p>
+      <w:pPr>
+        <w:pStyle w:val="FirstParagraph"/>
+      </w:pPr>
+      <w:r>
+        <w:rPr>
+          <w:bCs/>
+          <w:b/>
+        </w:rPr>
         <w:t xml:space="preserve">Instrucciones:</w:t>
       </w:r>
-    </w:p>
-    <w:p>
-      <w:pPr>
-        <w:pStyle w:val="FirstParagraph"/>
-      </w:pPr>
-      <w:r>
-        <w:t xml:space="preserve">Busca en tu casa 5 cosas que podrían terminar en el mar. Dibuja o pega una foto.</w:t>
+      <w:r>
+        <w:t xml:space="preserve"> </w:t>
+      </w:r>
+      <w:r>
+        <w:t xml:space="preserve">Busca en tu casa 5 cosas que podrían terminar en el mar. Clasifica según material y tiempo de descomposición.</w:t>
       </w:r>
     </w:p>
     <w:tbl>
       <w:tblPr>
         <w:tblStyle w:val="Table"/>
-        <w:tblW w:type="auto" w:w="0"/>
+        <w:tblW w:type="pct" w:w="5000"/>
         <w:tblLook w:firstRow="1" w:lastRow="0" w:firstColumn="0" w:lastColumn="0" w:noHBand="0" w:noVBand="0" w:val="0020"/>
         <w:jc w:val="start"/>
       </w:tblPr>
       <w:tblGrid>
-        <w:gridCol w:w="2640"/>
-        <w:gridCol w:w="2640"/>
-        <w:gridCol w:w="2640"/>
+        <w:gridCol w:w="308"/>
+        <w:gridCol w:w="822"/>
+        <w:gridCol w:w="1028"/>
+        <w:gridCol w:w="1645"/>
+        <w:gridCol w:w="1645"/>
+        <w:gridCol w:w="2468"/>
       </w:tblGrid>
       <w:tr>
         <w:trPr>
@@ -103,6 +133,18 @@
               <w:jc w:val="left"/>
             </w:pPr>
             <w:r>
+              <w:t xml:space="preserve">#</w:t>
+            </w:r>
+          </w:p>
+        </w:tc>
+        <w:tc>
+          <w:tcPr/>
+          <w:p>
+            <w:pPr>
+              <w:pStyle w:val="Compact"/>
+              <w:jc w:val="left"/>
+            </w:pPr>
+            <w:r>
               <w:t xml:space="preserve">Objeto</w:t>
             </w:r>
           </w:p>
@@ -115,6 +157,18 @@
               <w:jc w:val="left"/>
             </w:pPr>
             <w:r>
+              <w:t xml:space="preserve">Material</w:t>
+            </w:r>
+          </w:p>
+        </w:tc>
+        <w:tc>
+          <w:tcPr/>
+          <w:p>
+            <w:pPr>
+              <w:pStyle w:val="Compact"/>
+              <w:jc w:val="left"/>
+            </w:pPr>
+            <w:r>
               <w:t xml:space="preserve">¿Se descompone?</w:t>
             </w:r>
           </w:p>
@@ -128,6 +182,18 @@
             </w:pPr>
             <w:r>
               <w:t xml:space="preserve">¿Llega al mar?</w:t>
+            </w:r>
+          </w:p>
+        </w:tc>
+        <w:tc>
+          <w:tcPr/>
+          <w:p>
+            <w:pPr>
+              <w:pStyle w:val="Compact"/>
+              <w:jc w:val="left"/>
+            </w:pPr>
+            <w:r>
+              <w:t xml:space="preserve">Tiempo en descomponerse</w:t>
             </w:r>
           </w:p>
         </w:tc>
@@ -141,7 +207,31 @@
               <w:jc w:val="left"/>
             </w:pPr>
             <w:r>
-              <w:t xml:space="preserve">1. ________________</w:t>
+              <w:t xml:space="preserve">1</w:t>
+            </w:r>
+          </w:p>
+        </w:tc>
+        <w:tc>
+          <w:tcPr/>
+          <w:p>
+            <w:pPr>
+              <w:pStyle w:val="Compact"/>
+              <w:jc w:val="left"/>
+            </w:pPr>
+            <w:r>
+              <w:t xml:space="preserve">________________</w:t>
+            </w:r>
+          </w:p>
+        </w:tc>
+        <w:tc>
+          <w:tcPr/>
+          <w:p>
+            <w:pPr>
+              <w:pStyle w:val="Compact"/>
+              <w:jc w:val="left"/>
+            </w:pPr>
+            <w:r>
+              <w:t xml:space="preserve">Plástico / Papel / Vidrio / Metal / Otro: ___</w:t>
             </w:r>
           </w:p>
         </w:tc>
@@ -166,6 +256,18 @@
             </w:pPr>
             <w:r>
               <w:t xml:space="preserve">⭕ Sí 🔴 No</w:t>
+            </w:r>
+          </w:p>
+        </w:tc>
+        <w:tc>
+          <w:tcPr/>
+          <w:p>
+            <w:pPr>
+              <w:pStyle w:val="Compact"/>
+              <w:jc w:val="left"/>
+            </w:pPr>
+            <w:r>
+              <w:t xml:space="preserve">________________</w:t>
             </w:r>
           </w:p>
         </w:tc>
@@ -179,7 +281,31 @@
               <w:jc w:val="left"/>
             </w:pPr>
             <w:r>
-              <w:t xml:space="preserve">2. ________________</w:t>
+              <w:t xml:space="preserve">2</w:t>
+            </w:r>
+          </w:p>
+        </w:tc>
+        <w:tc>
+          <w:tcPr/>
+          <w:p>
+            <w:pPr>
+              <w:pStyle w:val="Compact"/>
+              <w:jc w:val="left"/>
+            </w:pPr>
+            <w:r>
+              <w:t xml:space="preserve">________________</w:t>
+            </w:r>
+          </w:p>
+        </w:tc>
+        <w:tc>
+          <w:tcPr/>
+          <w:p>
+            <w:pPr>
+              <w:pStyle w:val="Compact"/>
+              <w:jc w:val="left"/>
+            </w:pPr>
+            <w:r>
+              <w:t xml:space="preserve">Plástico / Papel / Vidrio / Metal / Otro: ___</w:t>
             </w:r>
           </w:p>
         </w:tc>
@@ -204,6 +330,18 @@
             </w:pPr>
             <w:r>
               <w:t xml:space="preserve">⭕ Sí 🔴 No</w:t>
+            </w:r>
+          </w:p>
+        </w:tc>
+        <w:tc>
+          <w:tcPr/>
+          <w:p>
+            <w:pPr>
+              <w:pStyle w:val="Compact"/>
+              <w:jc w:val="left"/>
+            </w:pPr>
+            <w:r>
+              <w:t xml:space="preserve">________________</w:t>
             </w:r>
           </w:p>
         </w:tc>
@@ -217,7 +355,31 @@
               <w:jc w:val="left"/>
             </w:pPr>
             <w:r>
-              <w:t xml:space="preserve">3. ________________</w:t>
+              <w:t xml:space="preserve">3</w:t>
+            </w:r>
+          </w:p>
+        </w:tc>
+        <w:tc>
+          <w:tcPr/>
+          <w:p>
+            <w:pPr>
+              <w:pStyle w:val="Compact"/>
+              <w:jc w:val="left"/>
+            </w:pPr>
+            <w:r>
+              <w:t xml:space="preserve">________________</w:t>
+            </w:r>
+          </w:p>
+        </w:tc>
+        <w:tc>
+          <w:tcPr/>
+          <w:p>
+            <w:pPr>
+              <w:pStyle w:val="Compact"/>
+              <w:jc w:val="left"/>
+            </w:pPr>
+            <w:r>
+              <w:t xml:space="preserve">Plástico / Papel / Vidrio / Metal / Otro: ___</w:t>
             </w:r>
           </w:p>
         </w:tc>
@@ -242,6 +404,18 @@
             </w:pPr>
             <w:r>
               <w:t xml:space="preserve">⭕ Sí 🔴 No</w:t>
+            </w:r>
+          </w:p>
+        </w:tc>
+        <w:tc>
+          <w:tcPr/>
+          <w:p>
+            <w:pPr>
+              <w:pStyle w:val="Compact"/>
+              <w:jc w:val="left"/>
+            </w:pPr>
+            <w:r>
+              <w:t xml:space="preserve">________________</w:t>
             </w:r>
           </w:p>
         </w:tc>
@@ -255,7 +429,31 @@
               <w:jc w:val="left"/>
             </w:pPr>
             <w:r>
-              <w:t xml:space="preserve">4. ________________</w:t>
+              <w:t xml:space="preserve">4</w:t>
+            </w:r>
+          </w:p>
+        </w:tc>
+        <w:tc>
+          <w:tcPr/>
+          <w:p>
+            <w:pPr>
+              <w:pStyle w:val="Compact"/>
+              <w:jc w:val="left"/>
+            </w:pPr>
+            <w:r>
+              <w:t xml:space="preserve">________________</w:t>
+            </w:r>
+          </w:p>
+        </w:tc>
+        <w:tc>
+          <w:tcPr/>
+          <w:p>
+            <w:pPr>
+              <w:pStyle w:val="Compact"/>
+              <w:jc w:val="left"/>
+            </w:pPr>
+            <w:r>
+              <w:t xml:space="preserve">Plástico / Papel / Vidrio / Metal / Otro: ___</w:t>
             </w:r>
           </w:p>
         </w:tc>
@@ -280,6 +478,18 @@
             </w:pPr>
             <w:r>
               <w:t xml:space="preserve">⭕ Sí 🔴 No</w:t>
+            </w:r>
+          </w:p>
+        </w:tc>
+        <w:tc>
+          <w:tcPr/>
+          <w:p>
+            <w:pPr>
+              <w:pStyle w:val="Compact"/>
+              <w:jc w:val="left"/>
+            </w:pPr>
+            <w:r>
+              <w:t xml:space="preserve">________________</w:t>
             </w:r>
           </w:p>
         </w:tc>
@@ -293,7 +503,31 @@
               <w:jc w:val="left"/>
             </w:pPr>
             <w:r>
-              <w:t xml:space="preserve">5. ________________</w:t>
+              <w:t xml:space="preserve">5</w:t>
+            </w:r>
+          </w:p>
+        </w:tc>
+        <w:tc>
+          <w:tcPr/>
+          <w:p>
+            <w:pPr>
+              <w:pStyle w:val="Compact"/>
+              <w:jc w:val="left"/>
+            </w:pPr>
+            <w:r>
+              <w:t xml:space="preserve">________________</w:t>
+            </w:r>
+          </w:p>
+        </w:tc>
+        <w:tc>
+          <w:tcPr/>
+          <w:p>
+            <w:pPr>
+              <w:pStyle w:val="Compact"/>
+              <w:jc w:val="left"/>
+            </w:pPr>
+            <w:r>
+              <w:t xml:space="preserve">Plástico / Papel / Vidrio / Metal / Otro: ___</w:t>
             </w:r>
           </w:p>
         </w:tc>
@@ -318,11 +552,41 @@
             </w:pPr>
             <w:r>
               <w:t xml:space="preserve">⭕ Sí 🔴 No</w:t>
+            </w:r>
+          </w:p>
+        </w:tc>
+        <w:tc>
+          <w:tcPr/>
+          <w:p>
+            <w:pPr>
+              <w:pStyle w:val="Compact"/>
+              <w:jc w:val="left"/>
+            </w:pPr>
+            <w:r>
+              <w:t xml:space="preserve">________________</w:t>
             </w:r>
           </w:p>
         </w:tc>
       </w:tr>
     </w:tbl>
+    <w:p>
+      <w:pPr>
+        <w:pStyle w:val="BodyText"/>
+      </w:pPr>
+      <w:r>
+        <w:rPr>
+          <w:bCs/>
+          <w:b/>
+        </w:rPr>
+        <w:t xml:space="preserve">Conteo total:</w:t>
+      </w:r>
+      <w:r>
+        <w:t xml:space="preserve"> </w:t>
+      </w:r>
+      <w:r>
+        <w:t xml:space="preserve">¿Cuántos objetos NO se descomponen? _______</w:t>
+      </w:r>
+    </w:p>
     <w:p>
       <w:pPr>
         <w:pStyle w:val="BodyText"/>
@@ -348,15 +612,15 @@
         </w:pict>
       </w:r>
     </w:p>
-    <w:bookmarkEnd w:id="20"/>
     <w:bookmarkEnd w:id="21"/>
-    <w:bookmarkStart w:id="23" w:name="ficha-2-dibuja-el-mar"/>
+    <w:bookmarkEnd w:id="22"/>
+    <w:bookmarkStart w:id="24" w:name="ficha-2-dibuja-el-mar"/>
     <w:p>
       <w:pPr>
         <w:pStyle w:val="Heading2"/>
       </w:pPr>
       <w:r>
-        <w:t xml:space="preserve">Ficha 2:</w:t>
+        <w:t xml:space="preserve">FICHA 2:</w:t>
       </w:r>
       <w:r>
         <w:t xml:space="preserve"> </w:t>
@@ -377,59 +641,159 @@
         <w:t xml:space="preserve">🎨</w:t>
       </w:r>
     </w:p>
-    <w:bookmarkStart w:id="22" w:name="instrucciones-1"/>
+    <w:bookmarkStart w:id="23" w:name="áreas-stem-s-ciencia-a-artes"/>
     <w:p>
       <w:pPr>
         <w:pStyle w:val="Heading3"/>
       </w:pPr>
       <w:r>
+        <w:t xml:space="preserve">Áreas STEM+: S (Ciencia), +A (Artes)</w:t>
+      </w:r>
+    </w:p>
+    <w:p>
+      <w:pPr>
+        <w:pStyle w:val="FirstParagraph"/>
+      </w:pPr>
+      <w:r>
+        <w:rPr>
+          <w:bCs/>
+          <w:b/>
+        </w:rPr>
         <w:t xml:space="preserve">Instrucciones:</w:t>
       </w:r>
+      <w:r>
+        <w:t xml:space="preserve"> </w:t>
+      </w:r>
+      <w:r>
+        <w:t xml:space="preserve">Dibuja y etiqueta las diferencias entre un mar limpio y uno contaminado.</w:t>
+      </w:r>
+    </w:p>
+    <w:p>
+      <w:pPr>
+        <w:pStyle w:val="SourceCode"/>
+      </w:pPr>
+      <w:r>
+        <w:rPr>
+          <w:rStyle w:val="VerbatimChar"/>
+        </w:rPr>
+        <w:t xml:space="preserve">┌─────────────────────────┐    ┌─────────────────────────┐</w:t>
+      </w:r>
+      <w:r>
+        <w:br/>
+      </w:r>
+      <w:r>
+        <w:rPr>
+          <w:rStyle w:val="VerbatimChar"/>
+        </w:rPr>
+        <w:t xml:space="preserve">│                         │    │                         │</w:t>
+      </w:r>
+      <w:r>
+        <w:br/>
+      </w:r>
+      <w:r>
+        <w:rPr>
+          <w:rStyle w:val="VerbatimChar"/>
+        </w:rPr>
+        <w:t xml:space="preserve">│     MAR LIMPIO          │    │     MAR CONTAMINADO     │</w:t>
+      </w:r>
+      <w:r>
+        <w:br/>
+      </w:r>
+      <w:r>
+        <w:rPr>
+          <w:rStyle w:val="VerbatimChar"/>
+        </w:rPr>
+        <w:t xml:space="preserve">│     (Saludable)         │    │     (Contaminado)       │</w:t>
+      </w:r>
+      <w:r>
+        <w:br/>
+      </w:r>
+      <w:r>
+        <w:rPr>
+          <w:rStyle w:val="VerbatimChar"/>
+        </w:rPr>
+        <w:t xml:space="preserve">│                         │    │                         │</w:t>
+      </w:r>
+      <w:r>
+        <w:br/>
+      </w:r>
+      <w:r>
+        <w:rPr>
+          <w:rStyle w:val="VerbatimChar"/>
+        </w:rPr>
+        <w:t xml:space="preserve">│                         │    │                         │</w:t>
+      </w:r>
+      <w:r>
+        <w:br/>
+      </w:r>
+      <w:r>
+        <w:rPr>
+          <w:rStyle w:val="VerbatimChar"/>
+        </w:rPr>
+        <w:t xml:space="preserve">│                         │    │                         │</w:t>
+      </w:r>
+      <w:r>
+        <w:br/>
+      </w:r>
+      <w:r>
+        <w:rPr>
+          <w:rStyle w:val="VerbatimChar"/>
+        </w:rPr>
+        <w:t xml:space="preserve">│                         │    │                         │</w:t>
+      </w:r>
+      <w:r>
+        <w:br/>
+      </w:r>
+      <w:r>
+        <w:rPr>
+          <w:rStyle w:val="VerbatimChar"/>
+        </w:rPr>
+        <w:t xml:space="preserve">│                         │    │                         │</w:t>
+      </w:r>
+      <w:r>
+        <w:br/>
+      </w:r>
+      <w:r>
+        <w:rPr>
+          <w:rStyle w:val="VerbatimChar"/>
+        </w:rPr>
+        <w:t xml:space="preserve">│                         │    │                         │</w:t>
+      </w:r>
+      <w:r>
+        <w:br/>
+      </w:r>
+      <w:r>
+        <w:rPr>
+          <w:rStyle w:val="VerbatimChar"/>
+        </w:rPr>
+        <w:t xml:space="preserve">│                         │    │                         │</w:t>
+      </w:r>
+      <w:r>
+        <w:br/>
+      </w:r>
+      <w:r>
+        <w:rPr>
+          <w:rStyle w:val="VerbatimChar"/>
+        </w:rPr>
+        <w:t xml:space="preserve">└─────────────────────────┘    └─────────────────────────┘</w:t>
+      </w:r>
     </w:p>
     <w:p>
       <w:pPr>
         <w:pStyle w:val="FirstParagraph"/>
       </w:pPr>
       <w:r>
-        <w:t xml:space="preserve">En la primera caja, dibuja un</w:t>
-      </w:r>
-      <w:r>
-        <w:t xml:space="preserve"> </w:t>
-      </w:r>
-      <w:r>
-        <w:rPr>
-          <w:bCs/>
-          <w:b/>
-        </w:rPr>
-        <w:t xml:space="preserve">mar limpio</w:t>
-      </w:r>
-      <w:r>
-        <w:t xml:space="preserve"> </w:t>
-      </w:r>
-      <w:r>
-        <w:t xml:space="preserve">con animales felices.</w:t>
-      </w:r>
-      <w:r>
-        <w:br/>
-      </w:r>
-      <w:r>
-        <w:t xml:space="preserve">En la segunda caja, dibuja un</w:t>
-      </w:r>
-      <w:r>
-        <w:t xml:space="preserve"> </w:t>
-      </w:r>
-      <w:r>
-        <w:rPr>
-          <w:bCs/>
-          <w:b/>
-        </w:rPr>
-        <w:t xml:space="preserve">mar sucio</w:t>
-      </w:r>
-      <w:r>
-        <w:t xml:space="preserve"> </w:t>
-      </w:r>
-      <w:r>
-        <w:t xml:space="preserve">con basura.</w:t>
+        <w:rPr>
+          <w:bCs/>
+          <w:b/>
+        </w:rPr>
+        <w:t xml:space="preserve">Animales que viven aquí:</w:t>
+      </w:r>
+      <w:r>
+        <w:t xml:space="preserve"> </w:t>
+      </w:r>
+      <w:r>
+        <w:t xml:space="preserve">________________________________</w:t>
       </w:r>
     </w:p>
     <w:p>
@@ -437,49 +801,17 @@
         <w:pStyle w:val="BodyText"/>
       </w:pPr>
       <w:r>
-        <w:t xml:space="preserve">┌─────────────────────┐ ┌─────────────────────┐</w:t>
-      </w:r>
-      <w:r>
-        <w:t xml:space="preserve"> </w:t>
-      </w:r>
-      <w:r>
-        <w:t xml:space="preserve">│ │ │ │</w:t>
-      </w:r>
-      <w:r>
-        <w:t xml:space="preserve"> </w:t>
-      </w:r>
-      <w:r>
-        <w:t xml:space="preserve">│ MAR LIMPIO │ │ MAR SUCIO │</w:t>
-      </w:r>
-      <w:r>
-        <w:t xml:space="preserve"> </w:t>
-      </w:r>
-      <w:r>
-        <w:t xml:space="preserve">│ 🐠🐢🐬🌊 │ │ 😢🛢️🥤 │</w:t>
-      </w:r>
-      <w:r>
-        <w:t xml:space="preserve"> </w:t>
-      </w:r>
-      <w:r>
-        <w:t xml:space="preserve">│ │ │ │</w:t>
-      </w:r>
-      <w:r>
-        <w:t xml:space="preserve"> </w:t>
-      </w:r>
-      <w:r>
-        <w:t xml:space="preserve">│ │ │ │</w:t>
-      </w:r>
-      <w:r>
-        <w:t xml:space="preserve"> </w:t>
-      </w:r>
-      <w:r>
-        <w:t xml:space="preserve">│ │ │ │</w:t>
-      </w:r>
-      <w:r>
-        <w:t xml:space="preserve"> </w:t>
-      </w:r>
-      <w:r>
-        <w:t xml:space="preserve">└─────────────────────┘ └─────────────────────┘</w:t>
+        <w:rPr>
+          <w:bCs/>
+          <w:b/>
+        </w:rPr>
+        <w:t xml:space="preserve">¿Qué les pasa cuando hay basura?</w:t>
+      </w:r>
+      <w:r>
+        <w:t xml:space="preserve"> </w:t>
+      </w:r>
+      <w:r>
+        <w:t xml:space="preserve">________________________________</w:t>
       </w:r>
     </w:p>
     <w:p>
@@ -491,13 +823,25 @@
           <w:bCs/>
           <w:b/>
         </w:rPr>
-        <w:t xml:space="preserve">¿Qué diferencias ves?</w:t>
-      </w:r>
-      <w:r>
-        <w:t xml:space="preserve"> </w:t>
-      </w:r>
-      <w:r>
-        <w:t xml:space="preserve">________________________________</w:t>
+        <w:t xml:space="preserve">¿Qué diferencias ves entre los dos mares?</w:t>
+      </w:r>
+      <w:r>
+        <w:t xml:space="preserve"> </w:t>
+      </w:r>
+      <w:r>
+        <w:t xml:space="preserve">1. ________________________________</w:t>
+      </w:r>
+      <w:r>
+        <w:t xml:space="preserve"> </w:t>
+      </w:r>
+      <w:r>
+        <w:t xml:space="preserve">2. ________________________________</w:t>
+      </w:r>
+      <w:r>
+        <w:t xml:space="preserve"> </w:t>
+      </w:r>
+      <w:r>
+        <w:t xml:space="preserve">3. ________________________________</w:t>
       </w:r>
     </w:p>
     <w:p>
@@ -507,15 +851,15 @@
         </w:pict>
       </w:r>
     </w:p>
-    <w:bookmarkEnd w:id="22"/>
     <w:bookmarkEnd w:id="23"/>
-    <w:bookmarkStart w:id="25" w:name="ficha-3-mi-promesa-al-mar"/>
+    <w:bookmarkEnd w:id="24"/>
+    <w:bookmarkStart w:id="26" w:name="ficha-3-mi-promesa-al-mar"/>
     <w:p>
       <w:pPr>
         <w:pStyle w:val="Heading2"/>
       </w:pPr>
       <w:r>
-        <w:t xml:space="preserve">Ficha 3:</w:t>
+        <w:t xml:space="preserve">FICHA 3:</w:t>
       </w:r>
       <w:r>
         <w:t xml:space="preserve"> </w:t>
@@ -536,80 +880,212 @@
         <w:t xml:space="preserve">🌊</w:t>
       </w:r>
     </w:p>
-    <w:bookmarkStart w:id="24" w:name="instrucciones-2"/>
+    <w:bookmarkStart w:id="25" w:name="X7e8ebebbe5707d33816d8ca8f2ec986ec78df7a"/>
     <w:p>
       <w:pPr>
         <w:pStyle w:val="Heading3"/>
       </w:pPr>
       <w:r>
+        <w:t xml:space="preserve">Áreas STEM+: E (Ingeniería), +A (Artes), +SS (Sociales)</w:t>
+      </w:r>
+    </w:p>
+    <w:p>
+      <w:pPr>
+        <w:pStyle w:val="FirstParagraph"/>
+      </w:pPr>
+      <w:r>
+        <w:rPr>
+          <w:bCs/>
+          <w:b/>
+        </w:rPr>
         <w:t xml:space="preserve">Instrucciones:</w:t>
       </w:r>
+      <w:r>
+        <w:t xml:space="preserve"> </w:t>
+      </w:r>
+      <w:r>
+        <w:t xml:space="preserve">Escribe 3 acciones concretas que tú y tu familia van a hacer para cuidar el mar. Piensa en cambios reales que pueden hacer en casa.</w:t>
+      </w:r>
+    </w:p>
+    <w:p>
+      <w:pPr>
+        <w:pStyle w:val="BodyText"/>
+      </w:pPr>
+      <w:r>
+        <w:rPr>
+          <w:bCs/>
+          <w:b/>
+        </w:rPr>
+        <w:t xml:space="preserve">Mi promesa #1 (Reducir):</w:t>
+      </w:r>
+      <w:r>
+        <w:t xml:space="preserve"> </w:t>
+      </w:r>
+      <w:r>
+        <w:t xml:space="preserve">________________________________</w:t>
+      </w:r>
+      <w:r>
+        <w:t xml:space="preserve"> </w:t>
+      </w:r>
+      <w:r>
+        <w:t xml:space="preserve">________________________________</w:t>
+      </w:r>
+    </w:p>
+    <w:p>
+      <w:pPr>
+        <w:pStyle w:val="BodyText"/>
+      </w:pPr>
+      <w:r>
+        <w:rPr>
+          <w:bCs/>
+          <w:b/>
+        </w:rPr>
+        <w:t xml:space="preserve">Mi promesa #2 (Reutilizar):</w:t>
+      </w:r>
+      <w:r>
+        <w:t xml:space="preserve"> </w:t>
+      </w:r>
+      <w:r>
+        <w:t xml:space="preserve">________________________________</w:t>
+      </w:r>
+      <w:r>
+        <w:t xml:space="preserve"> </w:t>
+      </w:r>
+      <w:r>
+        <w:t xml:space="preserve">________________________________</w:t>
+      </w:r>
+    </w:p>
+    <w:p>
+      <w:pPr>
+        <w:pStyle w:val="BodyText"/>
+      </w:pPr>
+      <w:r>
+        <w:rPr>
+          <w:bCs/>
+          <w:b/>
+        </w:rPr>
+        <w:t xml:space="preserve">Mi promesa #3 (Reciclar):</w:t>
+      </w:r>
+      <w:r>
+        <w:t xml:space="preserve"> </w:t>
+      </w:r>
+      <w:r>
+        <w:t xml:space="preserve">________________________________</w:t>
+      </w:r>
+      <w:r>
+        <w:t xml:space="preserve"> </w:t>
+      </w:r>
+      <w:r>
+        <w:t xml:space="preserve">________________________________</w:t>
+      </w:r>
+    </w:p>
+    <w:p>
+      <w:pPr>
+        <w:pStyle w:val="BodyText"/>
+      </w:pPr>
+      <w:r>
+        <w:rPr>
+          <w:bCs/>
+          <w:b/>
+        </w:rPr>
+        <w:t xml:space="preserve">Dibujo de mi cartel:</w:t>
+      </w:r>
+    </w:p>
+    <w:p>
+      <w:pPr>
+        <w:pStyle w:val="SourceCode"/>
+      </w:pPr>
+      <w:r>
+        <w:rPr>
+          <w:rStyle w:val="VerbatimChar"/>
+        </w:rPr>
+        <w:t xml:space="preserve">┌─────────────────────────┐</w:t>
+      </w:r>
+      <w:r>
+        <w:br/>
+      </w:r>
+      <w:r>
+        <w:rPr>
+          <w:rStyle w:val="VerbatimChar"/>
+        </w:rPr>
+        <w:t xml:space="preserve">│                         │</w:t>
+      </w:r>
+      <w:r>
+        <w:br/>
+      </w:r>
+      <w:r>
+        <w:rPr>
+          <w:rStyle w:val="VerbatimChar"/>
+        </w:rPr>
+        <w:t xml:space="preserve">│   MIS PROMESAS AL MAR   │</w:t>
+      </w:r>
+      <w:r>
+        <w:br/>
+      </w:r>
+      <w:r>
+        <w:rPr>
+          <w:rStyle w:val="VerbatimChar"/>
+        </w:rPr>
+        <w:t xml:space="preserve">│                         │</w:t>
+      </w:r>
+      <w:r>
+        <w:br/>
+      </w:r>
+      <w:r>
+        <w:rPr>
+          <w:rStyle w:val="VerbatimChar"/>
+        </w:rPr>
+        <w:t xml:space="preserve">│                         │</w:t>
+      </w:r>
+      <w:r>
+        <w:br/>
+      </w:r>
+      <w:r>
+        <w:rPr>
+          <w:rStyle w:val="VerbatimChar"/>
+        </w:rPr>
+        <w:t xml:space="preserve">│                         │</w:t>
+      </w:r>
+      <w:r>
+        <w:br/>
+      </w:r>
+      <w:r>
+        <w:rPr>
+          <w:rStyle w:val="VerbatimChar"/>
+        </w:rPr>
+        <w:t xml:space="preserve">│                         │</w:t>
+      </w:r>
+      <w:r>
+        <w:br/>
+      </w:r>
+      <w:r>
+        <w:rPr>
+          <w:rStyle w:val="VerbatimChar"/>
+        </w:rPr>
+        <w:t xml:space="preserve">│                         │</w:t>
+      </w:r>
+      <w:r>
+        <w:br/>
+      </w:r>
+      <w:r>
+        <w:rPr>
+          <w:rStyle w:val="VerbatimChar"/>
+        </w:rPr>
+        <w:t xml:space="preserve">│                         │</w:t>
+      </w:r>
+      <w:r>
+        <w:br/>
+      </w:r>
+      <w:r>
+        <w:rPr>
+          <w:rStyle w:val="VerbatimChar"/>
+        </w:rPr>
+        <w:t xml:space="preserve">└─────────────────────────┘</w:t>
+      </w:r>
     </w:p>
     <w:p>
       <w:pPr>
         <w:pStyle w:val="FirstParagraph"/>
-      </w:pPr>
-      <w:r>
-        <w:t xml:space="preserve">Escribe 3 cosas que tú y tu familia van a hacer para cuidar el mar.</w:t>
-      </w:r>
-    </w:p>
-    <w:p>
-      <w:pPr>
-        <w:pStyle w:val="BodyText"/>
-      </w:pPr>
-      <w:r>
-        <w:rPr>
-          <w:bCs/>
-          <w:b/>
-        </w:rPr>
-        <w:t xml:space="preserve">Mi promesa #1:</w:t>
-      </w:r>
-      <w:r>
-        <w:t xml:space="preserve"> </w:t>
-      </w:r>
-      <w:r>
-        <w:t xml:space="preserve">________________________________</w:t>
-      </w:r>
-    </w:p>
-    <w:p>
-      <w:pPr>
-        <w:pStyle w:val="BodyText"/>
-      </w:pPr>
-      <w:r>
-        <w:rPr>
-          <w:bCs/>
-          <w:b/>
-        </w:rPr>
-        <w:t xml:space="preserve">Mi promesa #2:</w:t>
-      </w:r>
-      <w:r>
-        <w:t xml:space="preserve"> </w:t>
-      </w:r>
-      <w:r>
-        <w:t xml:space="preserve">________________________________</w:t>
-      </w:r>
-    </w:p>
-    <w:p>
-      <w:pPr>
-        <w:pStyle w:val="BodyText"/>
-      </w:pPr>
-      <w:r>
-        <w:rPr>
-          <w:bCs/>
-          <w:b/>
-        </w:rPr>
-        <w:t xml:space="preserve">Mi promesa #3:</w:t>
-      </w:r>
-      <w:r>
-        <w:t xml:space="preserve"> </w:t>
-      </w:r>
-      <w:r>
-        <w:t xml:space="preserve">________________________________</w:t>
-      </w:r>
-    </w:p>
-    <w:p>
-      <w:pPr>
-        <w:pStyle w:val="BodyText"/>
       </w:pPr>
       <w:r>
         <w:rPr>
@@ -648,15 +1124,15 @@
         </w:pict>
       </w:r>
     </w:p>
-    <w:bookmarkEnd w:id="24"/>
     <w:bookmarkEnd w:id="25"/>
-    <w:bookmarkStart w:id="27" w:name="ficha-4-observación-del-experimento"/>
+    <w:bookmarkEnd w:id="26"/>
+    <w:bookmarkStart w:id="31" w:name="ficha-4-observación-del-experimento"/>
     <w:p>
       <w:pPr>
         <w:pStyle w:val="Heading2"/>
       </w:pPr>
       <w:r>
-        <w:t xml:space="preserve">Ficha 4:</w:t>
+        <w:t xml:space="preserve">FICHA 4:</w:t>
       </w:r>
       <w:r>
         <w:t xml:space="preserve"> </w:t>
@@ -677,13 +1153,13 @@
         <w:t xml:space="preserve">🔬</w:t>
       </w:r>
     </w:p>
-    <w:bookmarkStart w:id="26" w:name="instrucciones-3"/>
+    <w:bookmarkStart w:id="27" w:name="Xf2aa6ea052e6c409db6c690136f108e71944d7f"/>
     <w:p>
       <w:pPr>
         <w:pStyle w:val="Heading3"/>
       </w:pPr>
       <w:r>
-        <w:t xml:space="preserve">Instrucciones:</w:t>
+        <w:t xml:space="preserve">Áreas STEM+: S (Ciencia), M (Matemáticas), E (Ingeniería)</w:t>
       </w:r>
     </w:p>
     <w:p>
@@ -691,7 +1167,171 @@
         <w:pStyle w:val="FirstParagraph"/>
       </w:pPr>
       <w:r>
-        <w:t xml:space="preserve">Después de hacer el experimento con la botella, dibuja lo que viste.</w:t>
+        <w:rPr>
+          <w:bCs/>
+          <w:b/>
+        </w:rPr>
+        <w:t xml:space="preserve">Experimento:</w:t>
+      </w:r>
+      <w:r>
+        <w:t xml:space="preserve"> </w:t>
+      </w:r>
+      <w:r>
+        <w:t xml:space="preserve">“</w:t>
+      </w:r>
+      <w:r>
+        <w:t xml:space="preserve">Océano en una Botella</w:t>
+      </w:r>
+      <w:r>
+        <w:t xml:space="preserve">”</w:t>
+      </w:r>
+      <w:r>
+        <w:t xml:space="preserve"> </w:t>
+      </w:r>
+      <w:r>
+        <w:rPr>
+          <w:bCs/>
+          <w:b/>
+        </w:rPr>
+        <w:t xml:space="preserve">Materiales:</w:t>
+      </w:r>
+      <w:r>
+        <w:t xml:space="preserve"> </w:t>
+      </w:r>
+      <w:r>
+        <w:t xml:space="preserve">Botella, agua, arena, aceite, plásticos</w:t>
+      </w:r>
+    </w:p>
+    <w:bookmarkEnd w:id="27"/>
+    <w:bookmarkStart w:id="28" w:name="antes-estado-inicial"/>
+    <w:p>
+      <w:pPr>
+        <w:pStyle w:val="Heading3"/>
+      </w:pPr>
+      <w:r>
+        <w:t xml:space="preserve">ANTES (Estado Inicial)</w:t>
+      </w:r>
+    </w:p>
+    <w:p>
+      <w:pPr>
+        <w:pStyle w:val="FirstParagraph"/>
+      </w:pPr>
+      <w:r>
+        <w:rPr>
+          <w:bCs/>
+          <w:b/>
+        </w:rPr>
+        <w:t xml:space="preserve">Dibujo:</w:t>
+      </w:r>
+    </w:p>
+    <w:p>
+      <w:pPr>
+        <w:pStyle w:val="SourceCode"/>
+      </w:pPr>
+      <w:r>
+        <w:rPr>
+          <w:rStyle w:val="VerbatimChar"/>
+        </w:rPr>
+        <w:t xml:space="preserve">┌─────────────────────────┐</w:t>
+      </w:r>
+      <w:r>
+        <w:br/>
+      </w:r>
+      <w:r>
+        <w:rPr>
+          <w:rStyle w:val="VerbatimChar"/>
+        </w:rPr>
+        <w:t xml:space="preserve">│                         │</w:t>
+      </w:r>
+      <w:r>
+        <w:br/>
+      </w:r>
+      <w:r>
+        <w:rPr>
+          <w:rStyle w:val="VerbatimChar"/>
+        </w:rPr>
+        <w:t xml:space="preserve">│                         │</w:t>
+      </w:r>
+      <w:r>
+        <w:br/>
+      </w:r>
+      <w:r>
+        <w:rPr>
+          <w:rStyle w:val="VerbatimChar"/>
+        </w:rPr>
+        <w:t xml:space="preserve">│                         │</w:t>
+      </w:r>
+      <w:r>
+        <w:br/>
+      </w:r>
+      <w:r>
+        <w:rPr>
+          <w:rStyle w:val="VerbatimChar"/>
+        </w:rPr>
+        <w:t xml:space="preserve">│                         │</w:t>
+      </w:r>
+      <w:r>
+        <w:br/>
+      </w:r>
+      <w:r>
+        <w:rPr>
+          <w:rStyle w:val="VerbatimChar"/>
+        </w:rPr>
+        <w:t xml:space="preserve">│                         │</w:t>
+      </w:r>
+      <w:r>
+        <w:br/>
+      </w:r>
+      <w:r>
+        <w:rPr>
+          <w:rStyle w:val="VerbatimChar"/>
+        </w:rPr>
+        <w:t xml:space="preserve">│                         │</w:t>
+      </w:r>
+      <w:r>
+        <w:br/>
+      </w:r>
+      <w:r>
+        <w:rPr>
+          <w:rStyle w:val="VerbatimChar"/>
+        </w:rPr>
+        <w:t xml:space="preserve">│                         │</w:t>
+      </w:r>
+      <w:r>
+        <w:br/>
+      </w:r>
+      <w:r>
+        <w:rPr>
+          <w:rStyle w:val="VerbatimChar"/>
+        </w:rPr>
+        <w:t xml:space="preserve">│                         │</w:t>
+      </w:r>
+      <w:r>
+        <w:br/>
+      </w:r>
+      <w:r>
+        <w:rPr>
+          <w:rStyle w:val="VerbatimChar"/>
+        </w:rPr>
+        <w:t xml:space="preserve">└─────────────────────────┘</w:t>
+      </w:r>
+    </w:p>
+    <w:p>
+      <w:pPr>
+        <w:pStyle w:val="FirstParagraph"/>
+      </w:pPr>
+      <w:r>
+        <w:rPr>
+          <w:bCs/>
+          <w:b/>
+        </w:rPr>
+        <w:t xml:space="preserve">Descripción:</w:t>
+      </w:r>
+      <w:r>
+        <w:t xml:space="preserve"> </w:t>
+      </w:r>
+      <w:r>
+        <w:t xml:space="preserve">El agua está ________________ (limpia/turbia)</w:t>
       </w:r>
     </w:p>
     <w:p>
@@ -703,29 +1343,13 @@
           <w:bCs/>
           <w:b/>
         </w:rPr>
-        <w:t xml:space="preserve">ANTES</w:t>
-      </w:r>
-      <w:r>
-        <w:t xml:space="preserve"> </w:t>
-      </w:r>
-      <w:r>
-        <w:t xml:space="preserve">(agua limpia):</w:t>
-      </w:r>
-      <w:r>
-        <w:t xml:space="preserve"> </w:t>
-      </w:r>
-      <w:r>
-        <w:rPr>
-          <w:bCs/>
-          <w:b/>
-        </w:rPr>
-        <w:t xml:space="preserve">DESPUÉS</w:t>
-      </w:r>
-      <w:r>
-        <w:t xml:space="preserve"> </w:t>
-      </w:r>
-      <w:r>
-        <w:t xml:space="preserve">(con contaminación):</w:t>
+        <w:t xml:space="preserve">¿Qué ves en el fondo?</w:t>
+      </w:r>
+      <w:r>
+        <w:t xml:space="preserve"> </w:t>
+      </w:r>
+      <w:r>
+        <w:t xml:space="preserve">________________________________</w:t>
       </w:r>
     </w:p>
     <w:p>
@@ -733,79 +1357,17 @@
         <w:pStyle w:val="BodyText"/>
       </w:pPr>
       <w:r>
-        <w:t xml:space="preserve">┌─────────────────────┐ ┌─────────────────────┐</w:t>
-      </w:r>
-      <w:r>
-        <w:t xml:space="preserve"> </w:t>
-      </w:r>
-      <w:r>
-        <w:t xml:space="preserve">│ │ │ │</w:t>
-      </w:r>
-      <w:r>
-        <w:t xml:space="preserve"> </w:t>
-      </w:r>
-      <w:r>
-        <w:t xml:space="preserve">│ │ │ │</w:t>
-      </w:r>
-      <w:r>
-        <w:t xml:space="preserve"> </w:t>
-      </w:r>
-      <w:r>
-        <w:t xml:space="preserve">│ │ │ │</w:t>
-      </w:r>
-      <w:r>
-        <w:t xml:space="preserve"> </w:t>
-      </w:r>
-      <w:r>
-        <w:t xml:space="preserve">│ │ │ │</w:t>
-      </w:r>
-      <w:r>
-        <w:t xml:space="preserve"> </w:t>
-      </w:r>
-      <w:r>
-        <w:t xml:space="preserve">│ │ │ │</w:t>
-      </w:r>
-      <w:r>
-        <w:t xml:space="preserve"> </w:t>
-      </w:r>
-      <w:r>
-        <w:t xml:space="preserve">└─────────────────────┘ └─────────────────────┘</w:t>
-      </w:r>
-    </w:p>
-    <w:p>
-      <w:pPr>
-        <w:pStyle w:val="BodyText"/>
-      </w:pPr>
-      <w:r>
-        <w:rPr>
-          <w:bCs/>
-          <w:b/>
-        </w:rPr>
-        <w:t xml:space="preserve">¿Qué cambió?</w:t>
+        <w:rPr>
+          <w:bCs/>
+          <w:b/>
+        </w:rPr>
+        <w:t xml:space="preserve">¿Qué animales podrían vivir aquí?</w:t>
       </w:r>
       <w:r>
         <w:t xml:space="preserve"> </w:t>
       </w:r>
       <w:r>
         <w:t xml:space="preserve">________________________________</w:t>
-      </w:r>
-    </w:p>
-    <w:p>
-      <w:pPr>
-        <w:pStyle w:val="BodyText"/>
-      </w:pPr>
-      <w:r>
-        <w:rPr>
-          <w:bCs/>
-          <w:b/>
-        </w:rPr>
-        <w:t xml:space="preserve">¿Cómo se sienten los peces?</w:t>
-      </w:r>
-      <w:r>
-        <w:t xml:space="preserve"> </w:t>
-      </w:r>
-      <w:r>
-        <w:t xml:space="preserve">⭕ Felices ⭕ Tristes</w:t>
       </w:r>
     </w:p>
     <w:p>
@@ -815,6 +1377,507 @@
         </w:pict>
       </w:r>
     </w:p>
+    <w:bookmarkEnd w:id="28"/>
+    <w:bookmarkStart w:id="29" w:name="Xc45a8ee0b253599e897df081c1a226d5fcae74f"/>
+    <w:p>
+      <w:pPr>
+        <w:pStyle w:val="Heading3"/>
+      </w:pPr>
+      <w:r>
+        <w:t xml:space="preserve">DESPUÉS (Después de agregar aceite y plásticos)</w:t>
+      </w:r>
+    </w:p>
+    <w:p>
+      <w:pPr>
+        <w:pStyle w:val="FirstParagraph"/>
+      </w:pPr>
+      <w:r>
+        <w:rPr>
+          <w:bCs/>
+          <w:b/>
+        </w:rPr>
+        <w:t xml:space="preserve">Dibujo:</w:t>
+      </w:r>
+    </w:p>
+    <w:p>
+      <w:pPr>
+        <w:pStyle w:val="SourceCode"/>
+      </w:pPr>
+      <w:r>
+        <w:rPr>
+          <w:rStyle w:val="VerbatimChar"/>
+        </w:rPr>
+        <w:t xml:space="preserve">┌─────────────────────────┐</w:t>
+      </w:r>
+      <w:r>
+        <w:br/>
+      </w:r>
+      <w:r>
+        <w:rPr>
+          <w:rStyle w:val="VerbatimChar"/>
+        </w:rPr>
+        <w:t xml:space="preserve">│                         │</w:t>
+      </w:r>
+      <w:r>
+        <w:br/>
+      </w:r>
+      <w:r>
+        <w:rPr>
+          <w:rStyle w:val="VerbatimChar"/>
+        </w:rPr>
+        <w:t xml:space="preserve">│                         │</w:t>
+      </w:r>
+      <w:r>
+        <w:br/>
+      </w:r>
+      <w:r>
+        <w:rPr>
+          <w:rStyle w:val="VerbatimChar"/>
+        </w:rPr>
+        <w:t xml:space="preserve">│                         │</w:t>
+      </w:r>
+      <w:r>
+        <w:br/>
+      </w:r>
+      <w:r>
+        <w:rPr>
+          <w:rStyle w:val="VerbatimChar"/>
+        </w:rPr>
+        <w:t xml:space="preserve">│                         │</w:t>
+      </w:r>
+      <w:r>
+        <w:br/>
+      </w:r>
+      <w:r>
+        <w:rPr>
+          <w:rStyle w:val="VerbatimChar"/>
+        </w:rPr>
+        <w:t xml:space="preserve">│                         │</w:t>
+      </w:r>
+      <w:r>
+        <w:br/>
+      </w:r>
+      <w:r>
+        <w:rPr>
+          <w:rStyle w:val="VerbatimChar"/>
+        </w:rPr>
+        <w:t xml:space="preserve">│                         │</w:t>
+      </w:r>
+      <w:r>
+        <w:br/>
+      </w:r>
+      <w:r>
+        <w:rPr>
+          <w:rStyle w:val="VerbatimChar"/>
+        </w:rPr>
+        <w:t xml:space="preserve">│                         │</w:t>
+      </w:r>
+      <w:r>
+        <w:br/>
+      </w:r>
+      <w:r>
+        <w:rPr>
+          <w:rStyle w:val="VerbatimChar"/>
+        </w:rPr>
+        <w:t xml:space="preserve">│                         │</w:t>
+      </w:r>
+      <w:r>
+        <w:br/>
+      </w:r>
+      <w:r>
+        <w:rPr>
+          <w:rStyle w:val="VerbatimChar"/>
+        </w:rPr>
+        <w:t xml:space="preserve">└─────────────────────────┘</w:t>
+      </w:r>
+    </w:p>
+    <w:p>
+      <w:pPr>
+        <w:pStyle w:val="FirstParagraph"/>
+      </w:pPr>
+      <w:r>
+        <w:rPr>
+          <w:bCs/>
+          <w:b/>
+        </w:rPr>
+        <w:t xml:space="preserve">Descripción:</w:t>
+      </w:r>
+      <w:r>
+        <w:t xml:space="preserve"> </w:t>
+      </w:r>
+      <w:r>
+        <w:t xml:space="preserve">El agua está ________________ (limpia/turbia)</w:t>
+      </w:r>
+    </w:p>
+    <w:p>
+      <w:pPr>
+        <w:pStyle w:val="BodyText"/>
+      </w:pPr>
+      <w:r>
+        <w:rPr>
+          <w:bCs/>
+          <w:b/>
+        </w:rPr>
+        <w:t xml:space="preserve">¿Qué cambió en la superficie?</w:t>
+      </w:r>
+      <w:r>
+        <w:t xml:space="preserve"> </w:t>
+      </w:r>
+      <w:r>
+        <w:t xml:space="preserve">________________________________</w:t>
+      </w:r>
+    </w:p>
+    <w:p>
+      <w:pPr>
+        <w:pStyle w:val="BodyText"/>
+      </w:pPr>
+      <w:r>
+        <w:rPr>
+          <w:bCs/>
+          <w:b/>
+        </w:rPr>
+        <w:t xml:space="preserve">¿Dónde quedaron los plásticos?</w:t>
+      </w:r>
+      <w:r>
+        <w:t xml:space="preserve"> </w:t>
+      </w:r>
+      <w:r>
+        <w:t xml:space="preserve">⭕ Fondo ⭕ Medio ⭕ Superficie</w:t>
+      </w:r>
+    </w:p>
+    <w:p>
+      <w:pPr>
+        <w:pStyle w:val="BodyText"/>
+      </w:pPr>
+      <w:r>
+        <w:rPr>
+          <w:bCs/>
+          <w:b/>
+        </w:rPr>
+        <w:t xml:space="preserve">¿Cómo se sienten los peces?</w:t>
+      </w:r>
+      <w:r>
+        <w:t xml:space="preserve"> </w:t>
+      </w:r>
+      <w:r>
+        <w:t xml:space="preserve">⭕ Felices ⭕ Tristes ⭕ Enfermos</w:t>
+      </w:r>
+    </w:p>
+    <w:p>
+      <w:r>
+        <w:pict>
+          <v:rect style="width:0;height:1.5pt" o:hralign="center" o:hrstd="t" o:hr="t"/>
+        </w:pict>
+      </w:r>
+    </w:p>
+    <w:bookmarkEnd w:id="29"/>
+    <w:bookmarkStart w:id="30" w:name="análisis"/>
+    <w:p>
+      <w:pPr>
+        <w:pStyle w:val="Heading3"/>
+      </w:pPr>
+      <w:r>
+        <w:t xml:space="preserve">ANÁLISIS</w:t>
+      </w:r>
+    </w:p>
+    <w:p>
+      <w:pPr>
+        <w:pStyle w:val="FirstParagraph"/>
+      </w:pPr>
+      <w:r>
+        <w:rPr>
+          <w:bCs/>
+          <w:b/>
+        </w:rPr>
+        <w:t xml:space="preserve">¿Qué pasó cuando agregaste aceite?</w:t>
+      </w:r>
+      <w:r>
+        <w:t xml:space="preserve"> </w:t>
+      </w:r>
+      <w:r>
+        <w:t xml:space="preserve">________________________________</w:t>
+      </w:r>
+    </w:p>
+    <w:p>
+      <w:pPr>
+        <w:pStyle w:val="BodyText"/>
+      </w:pPr>
+      <w:r>
+        <w:rPr>
+          <w:bCs/>
+          <w:b/>
+        </w:rPr>
+        <w:t xml:space="preserve">¿Qué pasó cuando agregaste plásticos?</w:t>
+      </w:r>
+      <w:r>
+        <w:t xml:space="preserve"> </w:t>
+      </w:r>
+      <w:r>
+        <w:t xml:space="preserve">________________________________</w:t>
+      </w:r>
+    </w:p>
+    <w:p>
+      <w:pPr>
+        <w:pStyle w:val="BodyText"/>
+      </w:pPr>
+      <w:r>
+        <w:rPr>
+          <w:bCs/>
+          <w:b/>
+        </w:rPr>
+        <w:t xml:space="preserve">¿Por qué es peligroso para los animales?</w:t>
+      </w:r>
+      <w:r>
+        <w:t xml:space="preserve"> </w:t>
+      </w:r>
+      <w:r>
+        <w:t xml:space="preserve">________________________________</w:t>
+      </w:r>
+    </w:p>
+    <w:p>
+      <w:pPr>
+        <w:pStyle w:val="BodyText"/>
+      </w:pPr>
+      <w:r>
+        <w:rPr>
+          <w:bCs/>
+          <w:b/>
+        </w:rPr>
+        <w:t xml:space="preserve">¿Cuántos minutos dejamos reposar el experimento?</w:t>
+      </w:r>
+      <w:r>
+        <w:t xml:space="preserve"> </w:t>
+      </w:r>
+      <w:r>
+        <w:t xml:space="preserve">_______ minutos</w:t>
+      </w:r>
+    </w:p>
+    <w:p>
+      <w:pPr>
+        <w:pStyle w:val="BodyText"/>
+      </w:pPr>
+      <w:r>
+        <w:rPr>
+          <w:bCs/>
+          <w:b/>
+        </w:rPr>
+        <w:t xml:space="preserve">¿Qué pasó después de reposar?</w:t>
+      </w:r>
+      <w:r>
+        <w:t xml:space="preserve"> </w:t>
+      </w:r>
+      <w:r>
+        <w:t xml:space="preserve">________________________________</w:t>
+      </w:r>
+    </w:p>
+    <w:p>
+      <w:r>
+        <w:pict>
+          <v:rect style="width:0;height:1.5pt" o:hralign="center" o:hrstd="t" o:hr="t"/>
+        </w:pict>
+      </w:r>
+    </w:p>
+    <w:bookmarkEnd w:id="30"/>
+    <w:bookmarkEnd w:id="31"/>
+    <w:bookmarkStart w:id="33" w:name="ficha-5-mi-presentación-expoplay"/>
+    <w:p>
+      <w:pPr>
+        <w:pStyle w:val="Heading2"/>
+      </w:pPr>
+      <w:r>
+        <w:t xml:space="preserve">FICHA 5:</w:t>
+      </w:r>
+      <w:r>
+        <w:t xml:space="preserve"> </w:t>
+      </w:r>
+      <w:r>
+        <w:t xml:space="preserve">“</w:t>
+      </w:r>
+      <w:r>
+        <w:t xml:space="preserve">Mi Presentación ExpoPlay</w:t>
+      </w:r>
+      <w:r>
+        <w:t xml:space="preserve">”</w:t>
+      </w:r>
+      <w:r>
+        <w:t xml:space="preserve"> </w:t>
+      </w:r>
+      <w:r>
+        <w:t xml:space="preserve">🎪</w:t>
+      </w:r>
+    </w:p>
+    <w:bookmarkStart w:id="32" w:name="X0ae22c77f3cb7215c20c9d056f88e40d5f725cb"/>
+    <w:p>
+      <w:pPr>
+        <w:pStyle w:val="Heading3"/>
+      </w:pPr>
+      <w:r>
+        <w:t xml:space="preserve">Áreas STEM+: T (Tecnología), +A (Artes), +SS (Sociales)</w:t>
+      </w:r>
+    </w:p>
+    <w:p>
+      <w:pPr>
+        <w:pStyle w:val="FirstParagraph"/>
+      </w:pPr>
+      <w:r>
+        <w:rPr>
+          <w:bCs/>
+          <w:b/>
+        </w:rPr>
+        <w:t xml:space="preserve">Instrucciones:</w:t>
+      </w:r>
+      <w:r>
+        <w:t xml:space="preserve"> </w:t>
+      </w:r>
+      <w:r>
+        <w:t xml:space="preserve">Prepara tu actividad con la audiencia.</w:t>
+      </w:r>
+    </w:p>
+    <w:p>
+      <w:pPr>
+        <w:pStyle w:val="BodyText"/>
+      </w:pPr>
+      <w:r>
+        <w:rPr>
+          <w:bCs/>
+          <w:b/>
+        </w:rPr>
+        <w:t xml:space="preserve">Nombre de mi actividad:</w:t>
+      </w:r>
+      <w:r>
+        <w:t xml:space="preserve"> </w:t>
+      </w:r>
+      <w:r>
+        <w:t xml:space="preserve">________________________________</w:t>
+      </w:r>
+    </w:p>
+    <w:p>
+      <w:pPr>
+        <w:pStyle w:val="BodyText"/>
+      </w:pPr>
+      <w:r>
+        <w:rPr>
+          <w:bCs/>
+          <w:b/>
+        </w:rPr>
+        <w:t xml:space="preserve">Materiales que necesito:</w:t>
+      </w:r>
+      <w:r>
+        <w:t xml:space="preserve"> </w:t>
+      </w:r>
+      <w:r>
+        <w:t xml:space="preserve">1. ________________________________</w:t>
+      </w:r>
+      <w:r>
+        <w:t xml:space="preserve"> </w:t>
+      </w:r>
+      <w:r>
+        <w:t xml:space="preserve">2. ________________________________</w:t>
+      </w:r>
+      <w:r>
+        <w:t xml:space="preserve"> </w:t>
+      </w:r>
+      <w:r>
+        <w:t xml:space="preserve">3. ________________________________</w:t>
+      </w:r>
+    </w:p>
+    <w:p>
+      <w:pPr>
+        <w:pStyle w:val="BodyText"/>
+      </w:pPr>
+      <w:r>
+        <w:rPr>
+          <w:bCs/>
+          <w:b/>
+        </w:rPr>
+        <w:t xml:space="preserve">Paso 1:</w:t>
+      </w:r>
+      <w:r>
+        <w:t xml:space="preserve"> </w:t>
+      </w:r>
+      <w:r>
+        <w:t xml:space="preserve">________________________________</w:t>
+      </w:r>
+    </w:p>
+    <w:p>
+      <w:pPr>
+        <w:pStyle w:val="BodyText"/>
+      </w:pPr>
+      <w:r>
+        <w:rPr>
+          <w:bCs/>
+          <w:b/>
+        </w:rPr>
+        <w:t xml:space="preserve">Paso 2:</w:t>
+      </w:r>
+      <w:r>
+        <w:t xml:space="preserve"> </w:t>
+      </w:r>
+      <w:r>
+        <w:t xml:space="preserve">________________________________</w:t>
+      </w:r>
+    </w:p>
+    <w:p>
+      <w:pPr>
+        <w:pStyle w:val="BodyText"/>
+      </w:pPr>
+      <w:r>
+        <w:rPr>
+          <w:bCs/>
+          <w:b/>
+        </w:rPr>
+        <w:t xml:space="preserve">Paso 3:</w:t>
+      </w:r>
+      <w:r>
+        <w:t xml:space="preserve"> </w:t>
+      </w:r>
+      <w:r>
+        <w:t xml:space="preserve">________________________________</w:t>
+      </w:r>
+    </w:p>
+    <w:p>
+      <w:pPr>
+        <w:pStyle w:val="BodyText"/>
+      </w:pPr>
+      <w:r>
+        <w:rPr>
+          <w:bCs/>
+          <w:b/>
+        </w:rPr>
+        <w:t xml:space="preserve">Pregunta para la audiencia:</w:t>
+      </w:r>
+      <w:r>
+        <w:t xml:space="preserve"> </w:t>
+      </w:r>
+      <w:r>
+        <w:t xml:space="preserve">________________________________</w:t>
+      </w:r>
+    </w:p>
+    <w:p>
+      <w:pPr>
+        <w:pStyle w:val="BodyText"/>
+      </w:pPr>
+      <w:r>
+        <w:rPr>
+          <w:bCs/>
+          <w:b/>
+        </w:rPr>
+        <w:t xml:space="preserve">Mi frase para invitar a participar:</w:t>
+      </w:r>
+      <w:r>
+        <w:t xml:space="preserve"> </w:t>
+      </w:r>
+      <w:r>
+        <w:t xml:space="preserve">________________________________</w:t>
+      </w:r>
+    </w:p>
+    <w:p>
+      <w:r>
+        <w:pict>
+          <v:rect style="width:0;height:1.5pt" o:hralign="center" o:hrstd="t" o:hr="t"/>
+        </w:pict>
+      </w:r>
+    </w:p>
     <w:p>
       <w:pPr>
         <w:pStyle w:val="FirstParagraph"/>
@@ -832,10 +1895,20 @@
       <w:r>
         <w:t xml:space="preserve">👨‍👩‍👧‍👦</w:t>
       </w:r>
-    </w:p>
-    <w:bookmarkEnd w:id="26"/>
-    <w:bookmarkEnd w:id="27"/>
-    <w:bookmarkEnd w:id="28"/>
+      <w:r>
+        <w:t xml:space="preserve"> </w:t>
+      </w:r>
+      <w:r>
+        <w:rPr>
+          <w:iCs/>
+          <w:i/>
+        </w:rPr>
+        <w:t xml:space="preserve">Proyecto STEM+ para ExpoCiencia 2026</w:t>
+      </w:r>
+    </w:p>
+    <w:bookmarkEnd w:id="32"/>
+    <w:bookmarkEnd w:id="33"/>
+    <w:bookmarkEnd w:id="34"/>
     <w:sectPr/>
   </w:body>
 </w:document>

</xml_diff>